<commit_message>
docs: Enhance document upload functionality and update user journey
- Updated the document upload feature to allow attachments only in specific request statuses ("draft" and "returned for documents"), ensuring that documents are locked after submission to maintain review integrity.
- Added new user journey steps to reflect the ability to upload documents, including validation for file types and sizes.
- Revised the user journey documentation to include updated user roles and scenarios, ensuring clarity on the document handling process.
- Adjusted the Persian user interface to reflect the new features and changes in the workflow.
</commit_message>
<xml_diff>
--- a/docs/تحلیل-و-طراحی-پروژه-بیمه-تکمیلی.docx
+++ b/docs/تحلیل-و-طراحی-پروژه-بیمه-تکمیلی.docx
@@ -3135,7 +3135,7 @@
           <w:sz w:val="22"/>
           <w:szCs w:val="22"/>
         </w:rPr>
-        <w:t>•  طراحی منطق قابل توسعه برای ویژگی‌های آینده (مانند بارگذاری مدارک یا اعلان).</w:t>
+        <w:t>•  طراحی منطق قابل توسعه برای ویژگی‌های آینده (مانند سامانه اعلان یا تأیید چندسطحی).</w:t>
       </w:r>
     </w:p>
     <w:p>
@@ -3190,7 +3190,7 @@
           <w:sz w:val="22"/>
           <w:szCs w:val="22"/>
         </w:rPr>
-        <w:t>نیازمندی‌های عملکردی سامانه بر اساس پنج بازیگر اصلی — کارمند، کارشناس بررسی، مدیر سامانه، ممیز/حسابرس، و سامانه مادر — تحلیل و به شش سناریوی کاربری اصلی (Use Case) دسته‌بندی شده‌اند:</w:t>
+        <w:t>نیازمندی‌های عملکردی سامانه بر اساس پنج بازیگر اصلی — کارمند، کارشناس بررسی، مدیر سامانه، ممیز/حسابرس، و سامانه مادر — تحلیل و به هفت سناریوی کاربری اصلی (Use Case) دسته‌بندی شده‌اند:</w:t>
       </w:r>
     </w:p>
     <w:tbl>
@@ -3738,6 +3738,80 @@
                 <w:szCs w:val="20"/>
               </w:rPr>
               <w:t>سامانه مادر</w:t>
+            </w:r>
+          </w:p>
+        </w:tc>
+      </w:tr>
+      <w:tr>
+        <w:trPr>
+          <w:cantSplit/>
+        </w:trPr>
+        <w:tc>
+          <w:tcPr>
+            <w:tcW w:type="dxa" w:w="1020"/>
+          </w:tcPr>
+          <w:p>
+            <w:pPr>
+              <w:bidi/>
+              <w:spacing w:after="40" w:before="40" w:line="276" w:lineRule="auto"/>
+              <w:jc w:val="right"/>
+            </w:pPr>
+            <w:r/>
+            <w:r>
+              <w:rPr>
+                <w:rFonts w:ascii="Tahoma" w:hAnsi="Tahoma" w:cs="Tahoma"/>
+                <w:b w:val="0"/>
+                <w:color w:val="1A1A1A"/>
+                <w:sz w:val="20"/>
+                <w:szCs w:val="20"/>
+              </w:rPr>
+              <w:t>UC-7</w:t>
+            </w:r>
+          </w:p>
+        </w:tc>
+        <w:tc>
+          <w:tcPr>
+            <w:tcW w:type="dxa" w:w="5499"/>
+          </w:tcPr>
+          <w:p>
+            <w:pPr>
+              <w:bidi/>
+              <w:spacing w:after="40" w:before="40" w:line="276" w:lineRule="auto"/>
+              <w:jc w:val="right"/>
+            </w:pPr>
+            <w:r/>
+            <w:r>
+              <w:rPr>
+                <w:rFonts w:ascii="Tahoma" w:hAnsi="Tahoma" w:cs="Tahoma"/>
+                <w:b w:val="0"/>
+                <w:color w:val="1A1A1A"/>
+                <w:sz w:val="20"/>
+                <w:szCs w:val="20"/>
+              </w:rPr>
+              <w:t>بارگذاری مدارک پیوست درخواست و دریافت آن‌ها</w:t>
+            </w:r>
+          </w:p>
+        </w:tc>
+        <w:tc>
+          <w:tcPr>
+            <w:tcW w:type="dxa" w:w="1984"/>
+          </w:tcPr>
+          <w:p>
+            <w:pPr>
+              <w:bidi/>
+              <w:spacing w:after="40" w:before="40" w:line="276" w:lineRule="auto"/>
+              <w:jc w:val="right"/>
+            </w:pPr>
+            <w:r/>
+            <w:r>
+              <w:rPr>
+                <w:rFonts w:ascii="Tahoma" w:hAnsi="Tahoma" w:cs="Tahoma"/>
+                <w:b w:val="0"/>
+                <w:color w:val="1A1A1A"/>
+                <w:sz w:val="20"/>
+                <w:szCs w:val="20"/>
+              </w:rPr>
+              <w:t>کارمند / کارشناس بررسی</w:t>
             </w:r>
           </w:p>
         </w:tc>
@@ -4970,7 +5044,7 @@
           <w:sz w:val="22"/>
           <w:szCs w:val="22"/>
         </w:rPr>
-        <w:t>سامانه بیمه تکمیلی در قالب یک اپلیکیشن وب‌محور طراحی شده است که رفتار هر کاربر را بر اساس نقش او شکل می‌دهد؛ رابط کاربری شامل شانزده صفحه اصلی است و منوی هر کاربر و دکمه‌های فعال در صفحه جزئیات درخواست، تنها بر اساس نقش و وضعیت جاری آن درخواست ساخته می‌شوند — بنابراین کاربر هرگز با گزینه غیرمجاز مواجه نمی‌شود.</w:t>
+        <w:t>سامانه بیمه تکمیلی در قالب یک اپلیکیشن وب‌محور طراحی شده است که رفتار هر کاربر را بر اساس نقش او شکل می‌دهد؛ رابط کاربری شامل هفده صفحه اصلی است و منوی هر کاربر و دکمه‌های فعال در صفحه جزئیات درخواست، تنها بر اساس نقش و وضعیت جاری آن درخواست ساخته می‌شوند — بنابراین کاربر هرگز با گزینه غیرمجاز مواجه نمی‌شود.</w:t>
       </w:r>
     </w:p>
     <w:p>
@@ -7423,7 +7497,7 @@
           <w:sz w:val="22"/>
           <w:szCs w:val="22"/>
         </w:rPr>
-        <w:t>شانزده صفحه، کاملاً راست‌به‌چپ، تاریخ‌های هجری‌شمسی، اعداد فارسی، و حالت‌های نمایش روشن/تیره/خودکار.</w:t>
+        <w:t>هفده صفحه، کاملاً راست‌به‌چپ، تاریخ‌های هجری‌شمسی، اعداد فارسی، و حالت‌های نمایش روشن/تیره/خودکار.</w:t>
       </w:r>
     </w:p>
     <w:p>
@@ -7779,7 +7853,7 @@
                 <w:sz w:val="20"/>
                 <w:szCs w:val="20"/>
               </w:rPr>
-              <w:t>هدایت خودکار مرورگر بدون واسط گرافیکی در سیزده گام</w:t>
+              <w:t>هدایت خودکار مرورگر بدون واسط گرافیکی در چهارده گام</w:t>
             </w:r>
           </w:p>
         </w:tc>
@@ -8669,7 +8743,7 @@
                 <w:sz w:val="20"/>
                 <w:szCs w:val="20"/>
               </w:rPr>
-              <w:t>حدود ۵٬۱۰۰ خط</w:t>
+              <w:t>حدود ۵٬۹۰۰ خط</w:t>
             </w:r>
           </w:p>
         </w:tc>
@@ -8715,7 +8789,7 @@
                 <w:sz w:val="20"/>
                 <w:szCs w:val="20"/>
               </w:rPr>
-              <w:t>۳۰ مسیر / ۳۸ عملیات</w:t>
+              <w:t>۳۲ مسیر / ۴۲ عملیات</w:t>
             </w:r>
           </w:p>
         </w:tc>
@@ -8768,7 +8842,7 @@
                 <w:sz w:val="20"/>
                 <w:szCs w:val="20"/>
               </w:rPr>
-              <w:t>حدود ۱٬۱۰۰ خط</w:t>
+              <w:t>حدود ۱٬۶۰۰ خط</w:t>
             </w:r>
           </w:p>
         </w:tc>
@@ -8867,7 +8941,7 @@
                 <w:sz w:val="20"/>
                 <w:szCs w:val="20"/>
               </w:rPr>
-              <w:t>حدود ۴٬۰۰۰ خط</w:t>
+              <w:t>حدود ۵٬۶۰۰ خط</w:t>
             </w:r>
           </w:p>
         </w:tc>
@@ -8913,7 +8987,7 @@
                 <w:sz w:val="20"/>
                 <w:szCs w:val="20"/>
               </w:rPr>
-              <w:t>۱۶</w:t>
+              <w:t>۱۷</w:t>
             </w:r>
           </w:p>
         </w:tc>
@@ -11138,6 +11212,45 @@
           <w:szCs w:val="22"/>
           <w:bCs/>
         </w:rPr>
+        <w:t xml:space="preserve">مدارک پیوست با قفل‌شدن پس از ارسال: </w:t>
+      </w:r>
+      <w:r>
+        <w:rPr>
+          <w:rFonts w:ascii="Tahoma" w:hAnsi="Tahoma" w:cs="Tahoma"/>
+          <w:b w:val="0"/>
+          <w:color w:val="1A1A1A"/>
+          <w:sz w:val="22"/>
+          <w:szCs w:val="22"/>
+        </w:rPr>
+        <w:t>امکان بارگذاری فاکتور در وضعیت‌های مجاز، با تشخیص نوع فایل از روی محتوا و ثبت ممیزی هر بارگذاری.</w:t>
+      </w:r>
+    </w:p>
+    <w:p>
+      <w:pPr>
+        <w:bidi/>
+        <w:spacing w:after="80" w:line="336" w:lineRule="auto"/>
+        <w:ind w:right="340"/>
+        <w:jc w:val="both"/>
+      </w:pPr>
+      <w:r>
+        <w:rPr>
+          <w:rFonts w:ascii="Tahoma" w:hAnsi="Tahoma" w:cs="Tahoma"/>
+          <w:b w:val="0"/>
+          <w:color w:val="1A1A1A"/>
+          <w:sz w:val="22"/>
+          <w:szCs w:val="22"/>
+        </w:rPr>
+        <w:t xml:space="preserve">•  </w:t>
+      </w:r>
+      <w:r>
+        <w:rPr>
+          <w:rFonts w:ascii="Tahoma" w:hAnsi="Tahoma" w:cs="Tahoma"/>
+          <w:b/>
+          <w:color w:val="1A1A1A"/>
+          <w:sz w:val="22"/>
+          <w:szCs w:val="22"/>
+          <w:bCs/>
+        </w:rPr>
         <w:t xml:space="preserve">قابلیت‌مقیاس‌پذیری: </w:t>
       </w:r>
       <w:r>
@@ -11261,24 +11374,6 @@
           <w:bCs/>
         </w:rPr>
         <w:t>۷-۳ پیشنهادات آینده</w:t>
-      </w:r>
-    </w:p>
-    <w:p>
-      <w:pPr>
-        <w:bidi/>
-        <w:spacing w:after="80" w:line="336" w:lineRule="auto"/>
-        <w:ind w:right="340"/>
-        <w:jc w:val="both"/>
-      </w:pPr>
-      <w:r>
-        <w:rPr>
-          <w:rFonts w:ascii="Tahoma" w:hAnsi="Tahoma" w:cs="Tahoma"/>
-          <w:b w:val="0"/>
-          <w:color w:val="1A1A1A"/>
-          <w:sz w:val="22"/>
-          <w:szCs w:val="22"/>
-        </w:rPr>
-        <w:t>•  پیاده‌سازی سیستم بارگذاری مدارک پیوست: استفاده از رابط بارگذاری فایل برای امکان پیوست تصویر فاکتور توسط کارمند.</w:t>
       </w:r>
     </w:p>
     <w:p>

</xml_diff>